<commit_message>
chore: retire old host; production launch hardening
</commit_message>
<xml_diff>
--- a/apps/api/storage/tbc-documents/docx/tbc-brokerage-platform-separation.docx
+++ b/apps/api/storage/tbc-documents/docx/tbc-brokerage-platform-separation.docx
@@ -91,7 +91,7 @@
           <w:color w:val="946C25"/>
           <w:sz w:val="16"/>
         </w:rPr>
-        <w:t>TRADINGBIBLE.NET   •   DELAWARE, UNITED STATES   •   OCTOBER 2026</w:t>
+        <w:t>TRADINGBIBLE.APP   •   DELAWARE, UNITED STATES   •   OCTOBER 2026</w:t>
       </w:r>
     </w:p>
     <w:p/>
@@ -974,7 +974,7 @@
         <w:color w:val="5F656F"/>
         <w:sz w:val="16"/>
       </w:rPr>
-      <w:t>TRADINGBIBLE  •  COUNSEL BRIEFING 05  •  tradingbible.net</w:t>
+      <w:t>TRADINGBIBLE  •  COUNSEL BRIEFING 05  •  tradingbible.app</w:t>
     </w:r>
   </w:p>
 </w:ftr>

</xml_diff>